<commit_message>
court(oklacrimapp): brief on the merits gated on master's model (fb-595.54.61)
Engines regenerated; the URL, sign and heading-keep rules of fb-595.54.82 close the pass-1 blockers. latex and docx
break every line where typst does; tier 1 0 failed on every engine.

Co-Authored-By: Claude Opus 5.5 <noreply@anthropic.com>
</commit_message>
<xml_diff>
--- a/courts/tenth-circuit/oklahoma/state/court-of-criminal-appeals/brief-on-the-merits/usage/OUTPUT-brief-on-the-merits.docx
+++ b/courts/tenth-circuit/oklahoma/state/court-of-criminal-appeals/brief-on-the-merits/usage/OUTPUT-brief-on-the-merits.docx
@@ -5496,7 +5496,7 @@
         <w:pStyle w:val="BodyText"/>
       </w:pPr>
       <w:r>
-        <w:t xml:space="preserve">it out and he just I started raping [her],” she “guess[ed] .” (Tr. 3625) He also told her to “raise up and told [her] to suck his dick,” though she was unsure of the order of these events. I (Tr. 3626) She testified that the sexual intercourse lasted about 20 to 30 minutes, I though the AVL shows Officer Holtzclaw’s than about eleven minutes.</w:t>
+        <w:t xml:space="preserve">it out and he just I started raping [her],” she “guess[ed] .” (Tr. 3625) He also told her to “raise up and told [her] to suck his dick,” though she was unsure of the order of these events. I (Tr. 3626) She testified that the sexual intercourse lasted about 20 to 30 minutes, I though the AVL shows Officer Holtzclaw’s than about eleven minutes.</w:t>
       </w:r>
     </w:p>
     <w:p>
@@ -7158,7 +7158,7 @@
         <w:noBreakHyphen/>
       </w:r>
       <w:r>
-        <w:t xml:space="preserve">83. I 17 of its language or what its terms justify.” Leftwich v. State, 2015 OK CR 5, ,r 15, 350 I P.3d 149, 155.</w:t>
+        <w:t xml:space="preserve">83. I 17 of its language or what its terms justify.” Leftwich v. State, 2015 OK CR 5, ,r 15, 350 I P.3d 149, 155.</w:t>
       </w:r>
     </w:p>
     <w:p>
@@ -7592,7 +7592,7 @@
         <w:noBreakHyphen/>
       </w:r>
       <w:r>
-        <w:t xml:space="preserve">89) Based on this evidence, the Jury acquitted I 21 ,I Appellant of first degree rape but convicted him of forcible oral sodomy. It seems I plainly evident that the jury simply “spHt the baby” on these counts,</w:t>
+        <w:t xml:space="preserve">89) Based on this evidence, the Jury acquitted I 21 ,I Appellant of first degree rape but convicted him of forcible oral sodomy. It seems I plainly evident that the jury simply “spHt the baby” on these counts,</w:t>
       </w:r>
     </w:p>
     <w:p>
@@ -7764,7 +7764,7 @@
         <w:pStyle w:val="BodyText"/>
       </w:pPr>
       <w:r>
-        <w:t xml:space="preserve">the I legislative intent of this provision as intending to include within its parameters persons “owing special trust and confidence to those citizens ordered into their I custody or control.” Id. ,i 17, 243 P.3d at 464 (emphasis added). None of these alleged victims was ordered into the custody of any agency of government, and the I mere fact that they were detained did not transform them into wards of the state. I See, e.g., Maryland v. Shatzer, 559 U.S. 98, 113, 130 S. Ct. 1213, 1224, 175 L. Ed. 2d 1045 (2010) (expressly rejecting the notion that subjects of a traffic or Terry stop I are “in custody”).</w:t>
+        <w:t xml:space="preserve">the I legislative intent of this provision as intending to include within its parameters persons “owing special trust and confidence to those citizens ordered into their I custody or control.” Id. ,i 17, 243 P.3d at 464 (emphasis added). None of these alleged victims was ordered into the custody of any agency of government, and the I mere fact that they were detained did not transform them into wards of the state. I See, e.g., Maryland v. Shatzer, 559 U.S. 98, 113, 130 S. Ct. 1213, 1224, 175 L. Ed. 2d 1045 (2010) (expressly rejecting the notion that subjects of a traffic or Terry stop I are “in custody”).</w:t>
       </w:r>
     </w:p>
     <w:p>
@@ -9770,7 +9770,7 @@
         <w:pStyle w:val="BodyText"/>
       </w:pPr>
       <w:r>
-        <w:t xml:space="preserve">Although the charged offenses in Middaugh occurred within separate towns within the same county, and the Court did not elaborate as to why “the facts of this case” convinced it that separate towns were treated as “approximately the same location,” the period of time during which the illegal conduct occurred was only six weeks. 1988 OK CR 295 at, 10,767 I P .2d at 435. Without further guidance from the Court, it would seem that the only time separate crimes might fail to meet the same approximate location standard would be ones which occur in separate counties, in which case it is highly unlikely one court would properly I have venue and Jurisdiction over both crimes. greater overall plan. I Atnip v. State, 1977 OK CR 187, ~ 11,564 P.2d 660,663 (emphasis the common scheme or plan requirement is satisfied</w:t>
+        <w:t xml:space="preserve">Although the charged offenses in Middaugh occurred within separate towns within the same county, and the Court did not elaborate as to why “the facts of this case” convinced it that separate towns were treated as “approximately the same location,” the period of time during which the illegal conduct occurred was only six weeks. 1988 OK CR 295 at, 10,767 I P .2d at 435. Without further guidance from the Court, it would seem that the only time separate crimes might fail to meet the same approximate location standard would be ones which occur in separate counties, in which case it is highly unlikely one court would properly I have venue and Jurisdiction over both crimes. greater overall plan. I Atnip v. State, 1977 OK CR 187, ~ 11,564 P.2d 660,663 (emphasis the common scheme or plan requirement is satisfied</w:t>
       </w:r>
     </w:p>
     <w:p>
@@ -9968,7 +9968,7 @@
         <w:pStyle w:val="BodyText"/>
       </w:pPr>
       <w:r>
-        <w:t xml:space="preserve">but I in the aggregate and repeatedly told the jury to consider “all” the victims when evaluating the evidence. For example, “And you heard from the witness stand all I 13 victims tell you: …. “ (Tr. 4151); “And Jannie Ligons isn’t in the same area of I town where he stopped all of these other victims.” Ligons does just as all the other victims .. .. “(Id.); “I submit</w:t>
+        <w:t xml:space="preserve">but I in the aggregate and repeatedly told the jury to consider “all” the victims when evaluating the evidence. For example, “And you heard from the witness stand all I 13 victims tell you: …. “ (Tr. 4151); “And Jannie Ligons isn’t in the same area of I town where he stopped all of these other victims.” Ligons does just as all the other victims .. .. “(Id.); “I submit</w:t>
       </w:r>
     </w:p>
     <w:p>
@@ -10000,7 +10000,7 @@
         <w:pStyle w:val="BodyText"/>
       </w:pPr>
       <w:r>
-        <w:t xml:space="preserve">… ?” (Tr. 4184); “But at the end of the day to believe that the defendant</w:t>
+        <w:t xml:space="preserve">… ?” (Tr. 4184); “But at the end of the day to believe that the defendant</w:t>
       </w:r>
     </w:p>
     <w:p>
@@ -10176,7 +10176,7 @@
         <w:pStyle w:val="BodyText"/>
       </w:pPr>
       <w:r>
-        <w:t xml:space="preserve">so objectionable as I tending to confound the accused in his defense, or to prejudice him as to his challenges, in the matter of being held out to be habitually criminal, in the I distraction of the attention of the jury or otherwise.” Mc Elroy v. United States, 164 U.S. 76, 80, 17 S. Ct. 31, 32, 41 L. Ed. 355 (1896). Indeed, a criminal defendant has I a right to be convicted, if at all, by evidence showing him guilty of the charged I offense alone, Boyd v. United States, 142 U.S. 450, 458, 12 S.Ct. 292, 295, 35 L.Ed. 1077 (1892); Brockman v. State, 1936 OK CR 114, 61 P.2d 273,275, not on evidence I of other, unrelated crimes. When improper joinder has a substantial and injurious effect or influence in determining the jury’s verdict, it cannot be said that the I defendant has had a fundamentally fair trial and his due process rights are thereby I violated. See, e.g., Davis v. Woodford, 384 F .3d 628, 638 (9th Cir. 2004).</w:t>
+        <w:t xml:space="preserve">so objectionable as I tending to confound the accused in his defense, or to prejudice him as to his challenges, in the matter of being held out to be habitually criminal, in the I distraction of the attention of the jury or otherwise.” Mc Elroy v. United States, 164 U.S. 76, 80, 17 S. Ct. 31, 32, 41 L. Ed. 355 (1896). Indeed, a criminal defendant has I a right to be convicted, if at all, by evidence showing him guilty of the charged I offense alone, Boyd v. United States, 142 U.S. 450, 458, 12 S.Ct. 292, 295, 35 L.Ed. 1077 (1892); Brockman v. State, 1936 OK CR 114, 61 P.2d 273,275, not on evidence I of other, unrelated crimes. When improper joinder has a substantial and injurious effect or influence in determining the jury’s verdict, it cannot be said that the I defendant has had a fundamentally fair trial and his due process rights are thereby I violated. See, e.g., Davis v. Woodford, 384 F .3d 628, 638 (9th Cir. 2004).</w:t>
       </w:r>
     </w:p>
     <w:p>
@@ -11664,7 +11664,7 @@
         <w:pStyle w:val="BodyText"/>
       </w:pPr>
       <w:r>
-        <w:t xml:space="preserve">see, e.g., Darks v. State, 1998 OK CR 15, ,r 53, 954 P.2d 152, 166, that I freedom and latitude is nevertheless subject to the constraints of professional conduct and the right to a fair trial for both parties. See, e.g., Bechtel v. State, 1987 I OK CR 126, ,r 12, 738 P.2d 559, 561 (“This Court will not tolerate improper conduct I by any attorney control any uncalled</w:t>
+        <w:t xml:space="preserve">see, e.g., Darks v. State, 1998 OK CR 15, ,r 53, 954 P.2d 152, 166, that I freedom and latitude is nevertheless subject to the constraints of professional conduct and the right to a fair trial for both parties. See, e.g., Bechtel v. State, 1987 I OK CR 126, ,r 12, 738 P.2d 559, 561 (“This Court will not tolerate improper conduct I by any attorney control any uncalled</w:t>
       </w:r>
     </w:p>
     <w:p>
@@ -11876,7 +11876,7 @@
         <w:pStyle w:val="BodyText"/>
       </w:pPr>
       <w:r>
-        <w:t xml:space="preserve">asking the jury to draw a negative inference from I a defendant’s alleged failure to present evidence is clearly improper and requires reversal of Appellant’s convictions. See Sandstrom v. Montana, 442 U.S. 510, 524, I 35 99 S.Ct. 2450, 2459, 61 L.Ed.2d 39 (1979); Pettigrew v. State, 1976 OK CR 228, ,r 30, 554 P.2d 1186, 1194; see also Carter v. Kentucky, 450 U.S. 288, 101 s.ct. 1112, 67 I L.Ed.2d 241 (1981) (defendant entitled to no adverse inference instruction upon I request); Mullaney v. Wilbur, 421 U.S. 684, 703</w:t>
+        <w:t xml:space="preserve">asking the jury to draw a negative inference from I a defendant’s alleged failure to present evidence is clearly improper and requires reversal of Appellant’s convictions. See Sandstrom v. Montana, 442 U.S. 510, 524, I 35 99 S.Ct. 2450, 2459, 61 L.Ed.2d 39 (1979); Pettigrew v. State, 1976 OK CR 228, ,r 30, 554 P.2d 1186, 1194; see also Carter v. Kentucky, 450 U.S. 288, 101 s.ct. 1112, 67 I L.Ed.2d 241 (1981) (defendant entitled to no adverse inference instruction upon I request); Mullaney v. Wilbur, 421 U.S. 684, 703</w:t>
       </w:r>
       <w:r>
         <w:noBreakHyphen/>
@@ -11896,7 +11896,7 @@
         <w:tab/>
       </w:r>
       <w:r>
-        <w:t xml:space="preserve">Arguing Facts Not In Evidence I While counsel for parties have a liberal freedom of speech in closing I argument, that freedom is confined to the evidence actually presented at trial and the logical inferences therefrom. See Torres v. State, 1998 OK CR 40, ,r 48, 962 P.2d I 3, 18; Coulter v. State, 1987 OK CR 37, ,r 31, 734 P.2d 295, 302; Hager v. State, 1980 OK CR 51, ,r 119,612 P.2d 1369, 1373</w:t>
+        <w:t xml:space="preserve">Arguing Facts Not In Evidence I While counsel for parties have a liberal freedom of speech in closing I argument, that freedom is confined to the evidence actually presented at trial and the logical inferences therefrom. See Torres v. State, 1998 OK CR 40, ,r 48, 962 P.2d I 3, 18; Coulter v. State, 1987 OK CR 37, ,r 31, 734 P.2d 295, 302; Hager v. State, 1980 OK CR 51, ,r 119,612 P.2d 1369, 1373</w:t>
       </w:r>
       <w:r>
         <w:noBreakHyphen/>
@@ -12092,7 +12092,7 @@
         <w:noBreakHyphen/>
       </w:r>
       <w:r>
-        <w:t xml:space="preserve">49, 94 S.Ct. 1868, 1874, 40 L.Ed.2d 431 (1974); Smith v. State, 1987 OK CR 235, I , 7, 744 P.2d 1282, 1285.</w:t>
+        <w:t xml:space="preserve">49, 94 S.Ct. 1868, 1874, 40 L.Ed.2d 431 (1974); Smith v. State, 1987 OK CR 235, I , 7, 744 P.2d 1282, 1285.</w:t>
       </w:r>
     </w:p>
     <w:p>
@@ -12346,29 +12346,23 @@
         <w:pStyle w:val="BodyText"/>
       </w:pPr>
       <w:r>
-        <w:t xml:space="preserve">None of this misconduct was objected to at trial. It is an affirmative duty of I the trial court, however, “to maintain decorum in keeping with the nature of the proceeding; the judge is not a mere moderator, but is the governor oft he trialfor the I purpose of assuring its proper conduct.” Bechtel, supra at ,r 12, 738 P.2d at 561 I (emphasis added); see also Brown v. State, 1988 OK CR 59, ,r 16,753 P.2d 908,912 (“Trial judges have an affirmative obligation ‘to ensure that final argument to the I jury is kept within proper, accepted bounds”’) (quoting ABA Standards for Criminal Justice,§ 3</w:t>
-      </w:r>
-      <w:r>
-        <w:noBreakHyphen/>
-      </w:r>
-      <w:r>
-        <w:t xml:space="preserve">5.8(e) (1980)). This Court has not hesitated to review and I redress claims of prosecutorial misconduct where, as here, the prejudice to the I accused’s right to a fair trial is manifest. (“We will review these assignments</w:t>
-      </w:r>
-    </w:p>
-    <w:p>
-      <w:pPr>
-        <w:pStyle w:val="BodyText"/>
-      </w:pPr>
-      <w:r>
-        <w:t xml:space="preserve">See Tobler, supra at ,r 13,688 P.2d 350,353</w:t>
-      </w:r>
-    </w:p>
-    <w:p>
-      <w:pPr>
-        <w:pStyle w:val="BodyText"/>
-      </w:pPr>
-      <w:r>
-        <w:t xml:space="preserve">of error because there is no right which is more I essential to an accused’s defense than the right to a fair trial free from prejudice”); see also Coulter, supra at ,r 32,734 P.2d 295,302 (“ [T]his Court has consistently held I that [failure to object to prejudicial remarks] does not prevent correction of the I error when its effect is prejudicial to the fundamental Hager v. State, 1980 OK CR 51, ,r 20,612 P.2d at 1373 (“ [T]here</w:t>
+        <w:t xml:space="preserve">None of this misconduct was objected to at trial. It is an affirmative duty of I the trial court, however, “to maintain decorum in keeping with the nature of the proceeding; the judge is not a mere moderator, but is the governor oft he trialfor the I purpose of assuring its proper conduct.” Bechtel, supra at ,r 12, 738 P.2d at 561 I (emphasis added); see also Brown v. State, 1988 OK CR 59, ,r 16,753 P.2d 908,912 (“Trial judges have an affirmative obligation ‘to ensure that final argument to the I jury is kept within proper, accepted bounds”’) (quoting ABA Standards for Criminal Justice,§ 3-⁠5.8(e) (1980)). This Court has not hesitated to review and I redress claims of prosecutorial misconduct where, as here, the prejudice to the I accused’s right to a fair trial is manifest. (“We will review these assignments</w:t>
+      </w:r>
+    </w:p>
+    <w:p>
+      <w:pPr>
+        <w:pStyle w:val="BodyText"/>
+      </w:pPr>
+      <w:r>
+        <w:t xml:space="preserve">See Tobler, supra at ,r 13,688 P.2d 350,353</w:t>
+      </w:r>
+    </w:p>
+    <w:p>
+      <w:pPr>
+        <w:pStyle w:val="BodyText"/>
+      </w:pPr>
+      <w:r>
+        <w:t xml:space="preserve">of error because there is no right which is more I essential to an accused’s defense than the right to a fair trial free from prejudice”); see also Coulter, supra at ,r 32,734 P.2d 295,302 (“ [T]his Court has consistently held I that [failure to object to prejudicial remarks] does not prevent correction of the I error when its effect is prejudicial to the fundamental Hager v. State, 1980 OK CR 51, ,r 20,612 P.2d at 1373 (“ [T]here</w:t>
       </w:r>
     </w:p>
     <w:p>
@@ -18577,6 +18571,7 @@
     <w:unhideWhenUsed/>
     <w:qFormat/>
     <w:pPr>
+      <w:keepLines/>
       <w:spacing w:before="0" w:after="140" w:line="299" w:lineRule="exact"/>
     </w:pPr>
     <w:rPr>
@@ -18827,6 +18822,33 @@
     <w:pPr>
       <w:spacing w:before="0" w:after="0" w:line="299" w:lineRule="exact"/>
       <w:ind w:left="2160" w:hanging="720"/>
+    </w:pPr>
+  </w:style>
+  <w:style w:type="paragraph" w:customStyle="1" w:styleId="XdQuoteList1">
+    <w:name w:val="Xd Quote List 1"/>
+    <w:basedOn w:val="Normal"/>
+    <w:qFormat/>
+    <w:pPr>
+      <w:spacing w:before="0" w:after="0" w:line="299" w:lineRule="exact"/>
+      <w:ind w:left="2160" w:right="1440" w:hanging="720"/>
+    </w:pPr>
+  </w:style>
+  <w:style w:type="paragraph" w:customStyle="1" w:styleId="XdQuoteList2">
+    <w:name w:val="Xd Quote List 2"/>
+    <w:basedOn w:val="Normal"/>
+    <w:qFormat/>
+    <w:pPr>
+      <w:spacing w:before="0" w:after="0" w:line="299" w:lineRule="exact"/>
+      <w:ind w:left="2880" w:right="1440" w:hanging="720"/>
+    </w:pPr>
+  </w:style>
+  <w:style w:type="paragraph" w:customStyle="1" w:styleId="XdQuoteList3">
+    <w:name w:val="Xd Quote List 3"/>
+    <w:basedOn w:val="Normal"/>
+    <w:qFormat/>
+    <w:pPr>
+      <w:spacing w:before="0" w:after="0" w:line="299" w:lineRule="exact"/>
+      <w:ind w:left="3600" w:right="1440" w:hanging="720"/>
     </w:pPr>
   </w:style>
   <w:style w:type="paragraph" w:customStyle="1" w:styleId="XdList1">

</xml_diff>